<commit_message>
fix: update equity percentages in recruitment messages and team plan
</commit_message>
<xml_diff>
--- a/PRISM_Recruitment_&_Legal_Docs/Legal_Docs/PRISM_Vesting_Agreement_v2_0_0.docx
+++ b/PRISM_Recruitment_&_Legal_Docs/Legal_Docs/PRISM_Vesting_Agreement_v2_0_0.docx
@@ -150,12 +150,6 @@
         <w:gridCol w:w="6520"/>
       </w:tblGrid>
       <w:tr>
-        <w:tblPrEx>
-          <w:tblCellMar>
-            <w:top w:w="0" w:type="dxa"/>
-            <w:bottom w:w="0" w:type="dxa"/>
-          </w:tblCellMar>
-        </w:tblPrEx>
         <w:tc>
           <w:tcPr>
             <w:tcW w:w="3200" w:type="dxa"/>
@@ -212,12 +206,6 @@
         </w:tc>
       </w:tr>
       <w:tr>
-        <w:tblPrEx>
-          <w:tblCellMar>
-            <w:top w:w="0" w:type="dxa"/>
-            <w:bottom w:w="0" w:type="dxa"/>
-          </w:tblCellMar>
-        </w:tblPrEx>
         <w:tc>
           <w:tcPr>
             <w:tcW w:w="3200" w:type="dxa"/>
@@ -274,12 +262,6 @@
         </w:tc>
       </w:tr>
       <w:tr>
-        <w:tblPrEx>
-          <w:tblCellMar>
-            <w:top w:w="0" w:type="dxa"/>
-            <w:bottom w:w="0" w:type="dxa"/>
-          </w:tblCellMar>
-        </w:tblPrEx>
         <w:tc>
           <w:tcPr>
             <w:tcW w:w="3200" w:type="dxa"/>
@@ -336,12 +318,6 @@
         </w:tc>
       </w:tr>
       <w:tr>
-        <w:tblPrEx>
-          <w:tblCellMar>
-            <w:top w:w="0" w:type="dxa"/>
-            <w:bottom w:w="0" w:type="dxa"/>
-          </w:tblCellMar>
-        </w:tblPrEx>
         <w:tc>
           <w:tcPr>
             <w:tcW w:w="3200" w:type="dxa"/>
@@ -398,12 +374,6 @@
         </w:tc>
       </w:tr>
       <w:tr>
-        <w:tblPrEx>
-          <w:tblCellMar>
-            <w:top w:w="0" w:type="dxa"/>
-            <w:bottom w:w="0" w:type="dxa"/>
-          </w:tblCellMar>
-        </w:tblPrEx>
         <w:tc>
           <w:tcPr>
             <w:tcW w:w="3200" w:type="dxa"/>
@@ -460,12 +430,6 @@
         </w:tc>
       </w:tr>
       <w:tr>
-        <w:tblPrEx>
-          <w:tblCellMar>
-            <w:top w:w="0" w:type="dxa"/>
-            <w:bottom w:w="0" w:type="dxa"/>
-          </w:tblCellMar>
-        </w:tblPrEx>
         <w:tc>
           <w:tcPr>
             <w:tcW w:w="3200" w:type="dxa"/>
@@ -522,12 +486,6 @@
         </w:tc>
       </w:tr>
       <w:tr>
-        <w:tblPrEx>
-          <w:tblCellMar>
-            <w:top w:w="0" w:type="dxa"/>
-            <w:bottom w:w="0" w:type="dxa"/>
-          </w:tblCellMar>
-        </w:tblPrEx>
         <w:tc>
           <w:tcPr>
             <w:tcW w:w="3200" w:type="dxa"/>
@@ -584,12 +542,6 @@
         </w:tc>
       </w:tr>
       <w:tr>
-        <w:tblPrEx>
-          <w:tblCellMar>
-            <w:top w:w="0" w:type="dxa"/>
-            <w:bottom w:w="0" w:type="dxa"/>
-          </w:tblCellMar>
-        </w:tblPrEx>
         <w:tc>
           <w:tcPr>
             <w:tcW w:w="3200" w:type="dxa"/>
@@ -646,12 +598,6 @@
         </w:tc>
       </w:tr>
       <w:tr>
-        <w:tblPrEx>
-          <w:tblCellMar>
-            <w:top w:w="0" w:type="dxa"/>
-            <w:bottom w:w="0" w:type="dxa"/>
-          </w:tblCellMar>
-        </w:tblPrEx>
         <w:tc>
           <w:tcPr>
             <w:tcW w:w="3200" w:type="dxa"/>
@@ -708,12 +654,6 @@
         </w:tc>
       </w:tr>
       <w:tr>
-        <w:tblPrEx>
-          <w:tblCellMar>
-            <w:top w:w="0" w:type="dxa"/>
-            <w:bottom w:w="0" w:type="dxa"/>
-          </w:tblCellMar>
-        </w:tblPrEx>
         <w:tc>
           <w:tcPr>
             <w:tcW w:w="3200" w:type="dxa"/>
@@ -796,12 +736,6 @@
         <w:gridCol w:w="9720"/>
       </w:tblGrid>
       <w:tr>
-        <w:tblPrEx>
-          <w:tblCellMar>
-            <w:top w:w="0" w:type="dxa"/>
-            <w:bottom w:w="0" w:type="dxa"/>
-          </w:tblCellMar>
-        </w:tblPrEx>
         <w:tc>
           <w:tcPr>
             <w:tcW w:w="0" w:type="auto"/>
@@ -835,12 +769,6 @@
         </w:tc>
       </w:tr>
       <w:tr>
-        <w:tblPrEx>
-          <w:tblCellMar>
-            <w:top w:w="0" w:type="dxa"/>
-            <w:bottom w:w="0" w:type="dxa"/>
-          </w:tblCellMar>
-        </w:tblPrEx>
         <w:tc>
           <w:tcPr>
             <w:tcW w:w="0" w:type="auto"/>
@@ -874,12 +802,6 @@
         </w:tc>
       </w:tr>
       <w:tr>
-        <w:tblPrEx>
-          <w:tblCellMar>
-            <w:top w:w="0" w:type="dxa"/>
-            <w:bottom w:w="0" w:type="dxa"/>
-          </w:tblCellMar>
-        </w:tblPrEx>
         <w:tc>
           <w:tcPr>
             <w:tcW w:w="0" w:type="auto"/>
@@ -913,12 +835,6 @@
         </w:tc>
       </w:tr>
       <w:tr>
-        <w:tblPrEx>
-          <w:tblCellMar>
-            <w:top w:w="0" w:type="dxa"/>
-            <w:bottom w:w="0" w:type="dxa"/>
-          </w:tblCellMar>
-        </w:tblPrEx>
         <w:tc>
           <w:tcPr>
             <w:tcW w:w="0" w:type="auto"/>
@@ -952,12 +868,6 @@
         </w:tc>
       </w:tr>
       <w:tr>
-        <w:tblPrEx>
-          <w:tblCellMar>
-            <w:top w:w="0" w:type="dxa"/>
-            <w:bottom w:w="0" w:type="dxa"/>
-          </w:tblCellMar>
-        </w:tblPrEx>
         <w:tc>
           <w:tcPr>
             <w:tcW w:w="0" w:type="auto"/>
@@ -1146,12 +1056,6 @@
         <w:gridCol w:w="9720"/>
       </w:tblGrid>
       <w:tr>
-        <w:tblPrEx>
-          <w:tblCellMar>
-            <w:top w:w="0" w:type="dxa"/>
-            <w:bottom w:w="0" w:type="dxa"/>
-          </w:tblCellMar>
-        </w:tblPrEx>
         <w:tc>
           <w:tcPr>
             <w:tcW w:w="0" w:type="auto"/>
@@ -1880,12 +1784,6 @@
         <w:gridCol w:w="2920"/>
       </w:tblGrid>
       <w:tr>
-        <w:tblPrEx>
-          <w:tblCellMar>
-            <w:top w:w="0" w:type="dxa"/>
-            <w:bottom w:w="0" w:type="dxa"/>
-          </w:tblCellMar>
-        </w:tblPrEx>
         <w:tc>
           <w:tcPr>
             <w:tcW w:w="3600" w:type="dxa"/>
@@ -1981,12 +1879,6 @@
         </w:tc>
       </w:tr>
       <w:tr>
-        <w:tblPrEx>
-          <w:tblCellMar>
-            <w:top w:w="0" w:type="dxa"/>
-            <w:bottom w:w="0" w:type="dxa"/>
-          </w:tblCellMar>
-        </w:tblPrEx>
         <w:tc>
           <w:tcPr>
             <w:tcW w:w="3600" w:type="dxa"/>
@@ -2066,18 +1958,18 @@
               <w:rPr>
                 <w:color w:val="000000"/>
               </w:rPr>
-              <w:t>40%</w:t>
+              <w:t>45</w:t>
+            </w:r>
+            <w:r>
+              <w:rPr>
+                <w:color w:val="000000"/>
+              </w:rPr>
+              <w:t>%</w:t>
             </w:r>
           </w:p>
         </w:tc>
       </w:tr>
       <w:tr>
-        <w:tblPrEx>
-          <w:tblCellMar>
-            <w:top w:w="0" w:type="dxa"/>
-            <w:bottom w:w="0" w:type="dxa"/>
-          </w:tblCellMar>
-        </w:tblPrEx>
         <w:tc>
           <w:tcPr>
             <w:tcW w:w="3600" w:type="dxa"/>
@@ -2155,13 +2047,7 @@
               <w:rPr>
                 <w:color w:val="000000"/>
               </w:rPr>
-              <w:t>2</w:t>
-            </w:r>
-            <w:r>
-              <w:rPr>
-                <w:color w:val="000000"/>
-              </w:rPr>
-              <w:t>1</w:t>
+              <w:t>20</w:t>
             </w:r>
             <w:r>
               <w:rPr>
@@ -2173,12 +2059,6 @@
         </w:tc>
       </w:tr>
       <w:tr>
-        <w:tblPrEx>
-          <w:tblCellMar>
-            <w:top w:w="0" w:type="dxa"/>
-            <w:bottom w:w="0" w:type="dxa"/>
-          </w:tblCellMar>
-        </w:tblPrEx>
         <w:tc>
           <w:tcPr>
             <w:tcW w:w="3600" w:type="dxa"/>
@@ -2256,13 +2136,7 @@
               <w:rPr>
                 <w:color w:val="000000"/>
               </w:rPr>
-              <w:t>2</w:t>
-            </w:r>
-            <w:r>
-              <w:rPr>
-                <w:color w:val="000000"/>
-              </w:rPr>
-              <w:t>1</w:t>
+              <w:t>20</w:t>
             </w:r>
             <w:r>
               <w:rPr>
@@ -2274,12 +2148,6 @@
         </w:tc>
       </w:tr>
       <w:tr>
-        <w:tblPrEx>
-          <w:tblCellMar>
-            <w:top w:w="0" w:type="dxa"/>
-            <w:bottom w:w="0" w:type="dxa"/>
-          </w:tblCellMar>
-        </w:tblPrEx>
         <w:tc>
           <w:tcPr>
             <w:tcW w:w="3600" w:type="dxa"/>
@@ -2363,7 +2231,7 @@
               <w:rPr>
                 <w:color w:val="000000"/>
               </w:rPr>
-              <w:t>8</w:t>
+              <w:t>5</w:t>
             </w:r>
             <w:r>
               <w:rPr>
@@ -2375,12 +2243,6 @@
         </w:tc>
       </w:tr>
       <w:tr>
-        <w:tblPrEx>
-          <w:tblCellMar>
-            <w:top w:w="0" w:type="dxa"/>
-            <w:bottom w:w="0" w:type="dxa"/>
-          </w:tblCellMar>
-        </w:tblPrEx>
         <w:tc>
           <w:tcPr>
             <w:tcW w:w="3600" w:type="dxa"/>
@@ -2487,12 +2349,6 @@
         <w:gridCol w:w="9720"/>
       </w:tblGrid>
       <w:tr>
-        <w:tblPrEx>
-          <w:tblCellMar>
-            <w:top w:w="0" w:type="dxa"/>
-            <w:bottom w:w="0" w:type="dxa"/>
-          </w:tblCellMar>
-        </w:tblPrEx>
         <w:tc>
           <w:tcPr>
             <w:tcW w:w="0" w:type="auto"/>
@@ -3111,12 +2967,6 @@
         <w:gridCol w:w="3600"/>
       </w:tblGrid>
       <w:tr>
-        <w:tblPrEx>
-          <w:tblCellMar>
-            <w:top w:w="0" w:type="dxa"/>
-            <w:bottom w:w="0" w:type="dxa"/>
-          </w:tblCellMar>
-        </w:tblPrEx>
         <w:tc>
           <w:tcPr>
             <w:tcW w:w="2160" w:type="dxa"/>
@@ -3243,12 +3093,6 @@
         </w:tc>
       </w:tr>
       <w:tr>
-        <w:tblPrEx>
-          <w:tblCellMar>
-            <w:top w:w="0" w:type="dxa"/>
-            <w:bottom w:w="0" w:type="dxa"/>
-          </w:tblCellMar>
-        </w:tblPrEx>
         <w:tc>
           <w:tcPr>
             <w:tcW w:w="2160" w:type="dxa"/>
@@ -3363,12 +3207,6 @@
         </w:tc>
       </w:tr>
       <w:tr>
-        <w:tblPrEx>
-          <w:tblCellMar>
-            <w:top w:w="0" w:type="dxa"/>
-            <w:bottom w:w="0" w:type="dxa"/>
-          </w:tblCellMar>
-        </w:tblPrEx>
         <w:tc>
           <w:tcPr>
             <w:tcW w:w="2160" w:type="dxa"/>
@@ -3483,12 +3321,6 @@
         </w:tc>
       </w:tr>
       <w:tr>
-        <w:tblPrEx>
-          <w:tblCellMar>
-            <w:top w:w="0" w:type="dxa"/>
-            <w:bottom w:w="0" w:type="dxa"/>
-          </w:tblCellMar>
-        </w:tblPrEx>
         <w:tc>
           <w:tcPr>
             <w:tcW w:w="2160" w:type="dxa"/>
@@ -3603,12 +3435,6 @@
         </w:tc>
       </w:tr>
       <w:tr>
-        <w:tblPrEx>
-          <w:tblCellMar>
-            <w:top w:w="0" w:type="dxa"/>
-            <w:bottom w:w="0" w:type="dxa"/>
-          </w:tblCellMar>
-        </w:tblPrEx>
         <w:tc>
           <w:tcPr>
             <w:tcW w:w="2160" w:type="dxa"/>
@@ -3723,12 +3549,6 @@
         </w:tc>
       </w:tr>
       <w:tr>
-        <w:tblPrEx>
-          <w:tblCellMar>
-            <w:top w:w="0" w:type="dxa"/>
-            <w:bottom w:w="0" w:type="dxa"/>
-          </w:tblCellMar>
-        </w:tblPrEx>
         <w:tc>
           <w:tcPr>
             <w:tcW w:w="2160" w:type="dxa"/>
@@ -3865,13 +3685,13 @@
         <w:rPr>
           <w:color w:val="000000"/>
         </w:rPr>
-        <w:t>If Member B holds a 2</w:t>
-      </w:r>
-      <w:r>
-        <w:rPr>
-          <w:color w:val="000000"/>
-        </w:rPr>
-        <w:t>1</w:t>
+        <w:t xml:space="preserve">If Member B holds a </w:t>
+      </w:r>
+      <w:r>
+        <w:rPr>
+          <w:color w:val="000000"/>
+        </w:rPr>
+        <w:t>20</w:t>
       </w:r>
       <w:r>
         <w:rPr>
@@ -3893,13 +3713,13 @@
         <w:rPr>
           <w:color w:val="000000"/>
         </w:rPr>
-        <w:t>Month 3 Cliff:  2</w:t>
-      </w:r>
-      <w:r>
-        <w:rPr>
-          <w:color w:val="000000"/>
-        </w:rPr>
-        <w:t>1</w:t>
+        <w:t xml:space="preserve">Month 3 Cliff:  </w:t>
+      </w:r>
+      <w:r>
+        <w:rPr>
+          <w:color w:val="000000"/>
+        </w:rPr>
+        <w:t>20</w:t>
       </w:r>
       <w:r>
         <w:rPr>
@@ -3911,7 +3731,13 @@
         <w:rPr>
           <w:color w:val="000000"/>
         </w:rPr>
-        <w:t>5.25</w:t>
+        <w:t>5.</w:t>
+      </w:r>
+      <w:r>
+        <w:rPr>
+          <w:color w:val="000000"/>
+        </w:rPr>
+        <w:t>00</w:t>
       </w:r>
       <w:r>
         <w:rPr>
@@ -3933,13 +3759,13 @@
         <w:rPr>
           <w:color w:val="000000"/>
         </w:rPr>
-        <w:t>Months 4 – 10 (7 months):  2</w:t>
-      </w:r>
-      <w:r>
-        <w:rPr>
-          <w:color w:val="000000"/>
-        </w:rPr>
-        <w:t>1</w:t>
+        <w:t xml:space="preserve">Months 4 – 10 (7 months):  </w:t>
+      </w:r>
+      <w:r>
+        <w:rPr>
+          <w:color w:val="000000"/>
+        </w:rPr>
+        <w:t>20</w:t>
       </w:r>
       <w:r>
         <w:rPr>
@@ -3951,7 +3777,7 @@
         <w:rPr>
           <w:color w:val="000000"/>
         </w:rPr>
-        <w:t>1.3125%</w:t>
+        <w:t>1.25%</w:t>
       </w:r>
       <w:r>
         <w:rPr>
@@ -3969,7 +3795,13 @@
         <w:rPr>
           <w:color w:val="000000"/>
         </w:rPr>
-        <w:t>9.1875%</w:t>
+        <w:t>8.75</w:t>
+      </w:r>
+      <w:r>
+        <w:rPr>
+          <w:color w:val="000000"/>
+        </w:rPr>
+        <w:t>%</w:t>
       </w:r>
       <w:r>
         <w:rPr>
@@ -4015,7 +3847,13 @@
         <w:rPr>
           <w:color w:val="000000"/>
         </w:rPr>
-        <w:t>9.1875%</w:t>
+        <w:t>8.75</w:t>
+      </w:r>
+      <w:r>
+        <w:rPr>
+          <w:color w:val="000000"/>
+        </w:rPr>
+        <w:t>%</w:t>
       </w:r>
       <w:r>
         <w:rPr>
@@ -4033,7 +3871,7 @@
         <w:rPr>
           <w:color w:val="000000"/>
         </w:rPr>
-        <w:t>14.4375</w:t>
+        <w:t>13.75</w:t>
       </w:r>
       <w:r>
         <w:rPr>
@@ -4055,25 +3893,25 @@
         <w:rPr>
           <w:color w:val="000000"/>
         </w:rPr>
-        <w:t>Remaining unvested at Month 10:  2</w:t>
-      </w:r>
-      <w:r>
-        <w:rPr>
-          <w:color w:val="000000"/>
-        </w:rPr>
-        <w:t>1</w:t>
-      </w:r>
-      <w:r>
-        <w:rPr>
-          <w:color w:val="000000"/>
-        </w:rPr>
-        <w:t>% − 1</w:t>
-      </w:r>
-      <w:r>
-        <w:rPr>
-          <w:color w:val="000000"/>
-        </w:rPr>
-        <w:t>4.4375</w:t>
+        <w:t xml:space="preserve">Remaining unvested at Month 10:  </w:t>
+      </w:r>
+      <w:r>
+        <w:rPr>
+          <w:color w:val="000000"/>
+        </w:rPr>
+        <w:t>20</w:t>
+      </w:r>
+      <w:r>
+        <w:rPr>
+          <w:color w:val="000000"/>
+        </w:rPr>
+        <w:t xml:space="preserve">% − </w:t>
+      </w:r>
+      <w:r>
+        <w:rPr>
+          <w:color w:val="000000"/>
+        </w:rPr>
+        <w:t>13.75</w:t>
       </w:r>
       <w:r>
         <w:rPr>
@@ -4085,7 +3923,7 @@
         <w:rPr>
           <w:color w:val="000000"/>
         </w:rPr>
-        <w:t>6.5625</w:t>
+        <w:t>6.25</w:t>
       </w:r>
       <w:r>
         <w:rPr>
@@ -4129,7 +3967,6 @@
         <w:pStyle w:val="Heading2"/>
       </w:pPr>
       <w:r>
-        <w:lastRenderedPageBreak/>
         <w:t>3.3  Monthly Vesting — Precise Calculation</w:t>
       </w:r>
     </w:p>
@@ -4142,6 +3979,7 @@
         <w:rPr>
           <w:color w:val="000000"/>
         </w:rPr>
+        <w:lastRenderedPageBreak/>
         <w:t>The post-cliff monthly vesting rate is defined as: one-twelfth (1/12th) of the remaining 75% tranche of the Member's total Equity Grant per month, vesting at the end of each calendar month (Months 4 through 15). Expressed as percentages:</w:t>
       </w:r>
     </w:p>
@@ -4190,25 +4028,25 @@
         <w:rPr>
           <w:color w:val="000000"/>
         </w:rPr>
-        <w:t>For Member B (2</w:t>
-      </w:r>
-      <w:r>
-        <w:rPr>
-          <w:color w:val="000000"/>
-        </w:rPr>
-        <w:t>1</w:t>
-      </w:r>
-      <w:r>
-        <w:rPr>
-          <w:color w:val="000000"/>
-        </w:rPr>
-        <w:t>% grant): 2</w:t>
-      </w:r>
-      <w:r>
-        <w:rPr>
-          <w:color w:val="000000"/>
-        </w:rPr>
-        <w:t>1</w:t>
+        <w:t>For Member B (</w:t>
+      </w:r>
+      <w:r>
+        <w:rPr>
+          <w:color w:val="000000"/>
+        </w:rPr>
+        <w:t>20</w:t>
+      </w:r>
+      <w:r>
+        <w:rPr>
+          <w:color w:val="000000"/>
+        </w:rPr>
+        <w:t xml:space="preserve">% grant): </w:t>
+      </w:r>
+      <w:r>
+        <w:rPr>
+          <w:color w:val="000000"/>
+        </w:rPr>
+        <w:t>20</w:t>
       </w:r>
       <w:r>
         <w:rPr>
@@ -4220,7 +4058,7 @@
         <w:rPr>
           <w:color w:val="000000"/>
         </w:rPr>
-        <w:t>1.3125</w:t>
+        <w:t>1.25</w:t>
       </w:r>
       <w:r>
         <w:rPr>
@@ -4281,12 +4119,6 @@
         <w:gridCol w:w="6720"/>
       </w:tblGrid>
       <w:tr>
-        <w:tblPrEx>
-          <w:tblCellMar>
-            <w:top w:w="0" w:type="dxa"/>
-            <w:bottom w:w="0" w:type="dxa"/>
-          </w:tblCellMar>
-        </w:tblPrEx>
         <w:tc>
           <w:tcPr>
             <w:tcW w:w="3000" w:type="dxa"/>
@@ -4351,12 +4183,6 @@
         </w:tc>
       </w:tr>
       <w:tr>
-        <w:tblPrEx>
-          <w:tblCellMar>
-            <w:top w:w="0" w:type="dxa"/>
-            <w:bottom w:w="0" w:type="dxa"/>
-          </w:tblCellMar>
-        </w:tblPrEx>
         <w:tc>
           <w:tcPr>
             <w:tcW w:w="3000" w:type="dxa"/>
@@ -4413,12 +4239,6 @@
         </w:tc>
       </w:tr>
       <w:tr>
-        <w:tblPrEx>
-          <w:tblCellMar>
-            <w:top w:w="0" w:type="dxa"/>
-            <w:bottom w:w="0" w:type="dxa"/>
-          </w:tblCellMar>
-        </w:tblPrEx>
         <w:tc>
           <w:tcPr>
             <w:tcW w:w="3000" w:type="dxa"/>
@@ -4475,12 +4295,6 @@
         </w:tc>
       </w:tr>
       <w:tr>
-        <w:tblPrEx>
-          <w:tblCellMar>
-            <w:top w:w="0" w:type="dxa"/>
-            <w:bottom w:w="0" w:type="dxa"/>
-          </w:tblCellMar>
-        </w:tblPrEx>
         <w:tc>
           <w:tcPr>
             <w:tcW w:w="3000" w:type="dxa"/>
@@ -4537,12 +4351,6 @@
         </w:tc>
       </w:tr>
       <w:tr>
-        <w:tblPrEx>
-          <w:tblCellMar>
-            <w:top w:w="0" w:type="dxa"/>
-            <w:bottom w:w="0" w:type="dxa"/>
-          </w:tblCellMar>
-        </w:tblPrEx>
         <w:tc>
           <w:tcPr>
             <w:tcW w:w="3000" w:type="dxa"/>
@@ -4652,12 +4460,6 @@
         <w:gridCol w:w="6120"/>
       </w:tblGrid>
       <w:tr>
-        <w:tblPrEx>
-          <w:tblCellMar>
-            <w:top w:w="0" w:type="dxa"/>
-            <w:bottom w:w="0" w:type="dxa"/>
-          </w:tblCellMar>
-        </w:tblPrEx>
         <w:tc>
           <w:tcPr>
             <w:tcW w:w="1440" w:type="dxa"/>
@@ -4753,12 +4555,6 @@
         </w:tc>
       </w:tr>
       <w:tr>
-        <w:tblPrEx>
-          <w:tblCellMar>
-            <w:top w:w="0" w:type="dxa"/>
-            <w:bottom w:w="0" w:type="dxa"/>
-          </w:tblCellMar>
-        </w:tblPrEx>
         <w:tc>
           <w:tcPr>
             <w:tcW w:w="1440" w:type="dxa"/>
@@ -4845,12 +4641,6 @@
         </w:tc>
       </w:tr>
       <w:tr>
-        <w:tblPrEx>
-          <w:tblCellMar>
-            <w:top w:w="0" w:type="dxa"/>
-            <w:bottom w:w="0" w:type="dxa"/>
-          </w:tblCellMar>
-        </w:tblPrEx>
         <w:tc>
           <w:tcPr>
             <w:tcW w:w="1440" w:type="dxa"/>
@@ -4937,12 +4727,6 @@
         </w:tc>
       </w:tr>
       <w:tr>
-        <w:tblPrEx>
-          <w:tblCellMar>
-            <w:top w:w="0" w:type="dxa"/>
-            <w:bottom w:w="0" w:type="dxa"/>
-          </w:tblCellMar>
-        </w:tblPrEx>
         <w:tc>
           <w:tcPr>
             <w:tcW w:w="1440" w:type="dxa"/>
@@ -5029,12 +4813,6 @@
         </w:tc>
       </w:tr>
       <w:tr>
-        <w:tblPrEx>
-          <w:tblCellMar>
-            <w:top w:w="0" w:type="dxa"/>
-            <w:bottom w:w="0" w:type="dxa"/>
-          </w:tblCellMar>
-        </w:tblPrEx>
         <w:tc>
           <w:tcPr>
             <w:tcW w:w="1440" w:type="dxa"/>
@@ -5121,12 +4899,6 @@
         </w:tc>
       </w:tr>
       <w:tr>
-        <w:tblPrEx>
-          <w:tblCellMar>
-            <w:top w:w="0" w:type="dxa"/>
-            <w:bottom w:w="0" w:type="dxa"/>
-          </w:tblCellMar>
-        </w:tblPrEx>
         <w:tc>
           <w:tcPr>
             <w:tcW w:w="1440" w:type="dxa"/>
@@ -5243,12 +5015,6 @@
         <w:gridCol w:w="9720"/>
       </w:tblGrid>
       <w:tr>
-        <w:tblPrEx>
-          <w:tblCellMar>
-            <w:top w:w="0" w:type="dxa"/>
-            <w:bottom w:w="0" w:type="dxa"/>
-          </w:tblCellMar>
-        </w:tblPrEx>
         <w:tc>
           <w:tcPr>
             <w:tcW w:w="0" w:type="auto"/>
@@ -5277,7 +5043,6 @@
                 <w:iCs/>
                 <w:color w:val="000000"/>
               </w:rPr>
-              <w:lastRenderedPageBreak/>
               <w:t>সহজ</w:t>
             </w:r>
             <w:proofErr w:type="spellEnd"/>
@@ -6096,68 +5861,68 @@
         <w:rPr>
           <w:color w:val="000000"/>
         </w:rPr>
+        <w:t>The Founder shall provide the Member with written notice of any vesting suspension within seven (7) days of the end of the relevant month, with specific, itemised reasons stated. The Member shall have seven (7) days from receipt of notice to respond in writing.</w:t>
+      </w:r>
+    </w:p>
+    <w:p>
+      <w:pPr>
+        <w:spacing w:before="200"/>
+      </w:pPr>
+    </w:p>
+    <w:p>
+      <w:pPr>
+        <w:pStyle w:val="Heading1"/>
+      </w:pPr>
+      <w:r>
+        <w:t>5.  Termination &amp; Unvested Equity  (</w:t>
+      </w:r>
+      <w:proofErr w:type="spellStart"/>
+      <w:r>
+        <w:t>চুক্তি</w:t>
+      </w:r>
+      <w:proofErr w:type="spellEnd"/>
+      <w:r>
+        <w:t xml:space="preserve"> </w:t>
+      </w:r>
+      <w:proofErr w:type="spellStart"/>
+      <w:r>
+        <w:t>সমাপ্তি</w:t>
+      </w:r>
+      <w:proofErr w:type="spellEnd"/>
+      <w:r>
+        <w:t xml:space="preserve"> </w:t>
+      </w:r>
+      <w:proofErr w:type="spellStart"/>
+      <w:r>
+        <w:t>এবং</w:t>
+      </w:r>
+      <w:proofErr w:type="spellEnd"/>
+      <w:r>
+        <w:t xml:space="preserve"> </w:t>
+      </w:r>
+      <w:proofErr w:type="spellStart"/>
+      <w:r>
+        <w:t>অনর্জিত</w:t>
+      </w:r>
+      <w:proofErr w:type="spellEnd"/>
+      <w:r>
+        <w:t xml:space="preserve"> </w:t>
+      </w:r>
+      <w:proofErr w:type="spellStart"/>
+      <w:r>
+        <w:t>ইকুইটি</w:t>
+      </w:r>
+      <w:proofErr w:type="spellEnd"/>
+      <w:r>
+        <w:t>)</w:t>
+      </w:r>
+    </w:p>
+    <w:p>
+      <w:pPr>
+        <w:pStyle w:val="Heading2"/>
+      </w:pPr>
+      <w:r>
         <w:lastRenderedPageBreak/>
-        <w:t>The Founder shall provide the Member with written notice of any vesting suspension within seven (7) days of the end of the relevant month, with specific, itemised reasons stated. The Member shall have seven (7) days from receipt of notice to respond in writing.</w:t>
-      </w:r>
-    </w:p>
-    <w:p>
-      <w:pPr>
-        <w:spacing w:before="200"/>
-      </w:pPr>
-    </w:p>
-    <w:p>
-      <w:pPr>
-        <w:pStyle w:val="Heading1"/>
-      </w:pPr>
-      <w:r>
-        <w:t>5.  Termination &amp; Unvested Equity  (</w:t>
-      </w:r>
-      <w:proofErr w:type="spellStart"/>
-      <w:r>
-        <w:t>চুক্তি</w:t>
-      </w:r>
-      <w:proofErr w:type="spellEnd"/>
-      <w:r>
-        <w:t xml:space="preserve"> </w:t>
-      </w:r>
-      <w:proofErr w:type="spellStart"/>
-      <w:r>
-        <w:t>সমাপ্তি</w:t>
-      </w:r>
-      <w:proofErr w:type="spellEnd"/>
-      <w:r>
-        <w:t xml:space="preserve"> </w:t>
-      </w:r>
-      <w:proofErr w:type="spellStart"/>
-      <w:r>
-        <w:t>এবং</w:t>
-      </w:r>
-      <w:proofErr w:type="spellEnd"/>
-      <w:r>
-        <w:t xml:space="preserve"> </w:t>
-      </w:r>
-      <w:proofErr w:type="spellStart"/>
-      <w:r>
-        <w:t>অনর্জিত</w:t>
-      </w:r>
-      <w:proofErr w:type="spellEnd"/>
-      <w:r>
-        <w:t xml:space="preserve"> </w:t>
-      </w:r>
-      <w:proofErr w:type="spellStart"/>
-      <w:r>
-        <w:t>ইকুইটি</w:t>
-      </w:r>
-      <w:proofErr w:type="spellEnd"/>
-      <w:r>
-        <w:t>)</w:t>
-      </w:r>
-    </w:p>
-    <w:p>
-      <w:pPr>
-        <w:pStyle w:val="Heading2"/>
-      </w:pPr>
-      <w:r>
         <w:t>5.1  Voluntary Departure — General</w:t>
       </w:r>
     </w:p>
@@ -6360,12 +6125,6 @@
         <w:gridCol w:w="9720"/>
       </w:tblGrid>
       <w:tr>
-        <w:tblPrEx>
-          <w:tblCellMar>
-            <w:top w:w="0" w:type="dxa"/>
-            <w:bottom w:w="0" w:type="dxa"/>
-          </w:tblCellMar>
-        </w:tblPrEx>
         <w:tc>
           <w:tcPr>
             <w:tcW w:w="0" w:type="auto"/>
@@ -6399,12 +6158,6 @@
         </w:tc>
       </w:tr>
       <w:tr>
-        <w:tblPrEx>
-          <w:tblCellMar>
-            <w:top w:w="0" w:type="dxa"/>
-            <w:bottom w:w="0" w:type="dxa"/>
-          </w:tblCellMar>
-        </w:tblPrEx>
         <w:tc>
           <w:tcPr>
             <w:tcW w:w="0" w:type="auto"/>
@@ -6482,12 +6235,6 @@
         <w:gridCol w:w="9720"/>
       </w:tblGrid>
       <w:tr>
-        <w:tblPrEx>
-          <w:tblCellMar>
-            <w:top w:w="0" w:type="dxa"/>
-            <w:bottom w:w="0" w:type="dxa"/>
-          </w:tblCellMar>
-        </w:tblPrEx>
         <w:tc>
           <w:tcPr>
             <w:tcW w:w="0" w:type="auto"/>
@@ -7371,12 +7118,6 @@
         <w:gridCol w:w="9720"/>
       </w:tblGrid>
       <w:tr>
-        <w:tblPrEx>
-          <w:tblCellMar>
-            <w:top w:w="0" w:type="dxa"/>
-            <w:bottom w:w="0" w:type="dxa"/>
-          </w:tblCellMar>
-        </w:tblPrEx>
         <w:tc>
           <w:tcPr>
             <w:tcW w:w="0" w:type="auto"/>
@@ -7790,6 +7531,7 @@
         <w:pStyle w:val="Heading1"/>
       </w:pPr>
       <w:r>
+        <w:lastRenderedPageBreak/>
         <w:t>8.  Anti-Dilution &amp; Future Fundraising  (</w:t>
       </w:r>
       <w:proofErr w:type="spellStart"/>
@@ -8008,7 +7750,6 @@
         <w:rPr>
           <w:color w:val="000000"/>
         </w:rPr>
-        <w:lastRenderedPageBreak/>
         <w:t>This Agreement may be amended only by a written instrument signed by both parties. No oral modification shall be effective. If a new founding team member joins the project, a separate Vesting Agreement shall be executed with them; this Agreement shall not be modified to accommodate new members. Any amendment to the PRISM Commerce Team Plan v1.0 that materially affects the Active Contributor Standard or monthly deliverables for the Member's role shall require the Member's written consent before taking effect for vesting purposes.</w:t>
       </w:r>
     </w:p>
@@ -8052,6 +7793,7 @@
           <w:bCs/>
           <w:color w:val="000000"/>
         </w:rPr>
+        <w:lastRenderedPageBreak/>
         <w:t xml:space="preserve">12.1  </w:t>
       </w:r>
       <w:proofErr w:type="gramStart"/>
@@ -8252,7 +7994,6 @@
           <w:bCs/>
           <w:color w:val="000000"/>
         </w:rPr>
-        <w:lastRenderedPageBreak/>
         <w:t xml:space="preserve">14.2  Priority. </w:t>
       </w:r>
       <w:r>
@@ -8323,12 +8064,6 @@
         <w:gridCol w:w="4500"/>
       </w:tblGrid>
       <w:tr>
-        <w:tblPrEx>
-          <w:tblCellMar>
-            <w:top w:w="0" w:type="dxa"/>
-            <w:bottom w:w="0" w:type="dxa"/>
-          </w:tblCellMar>
-        </w:tblPrEx>
         <w:tc>
           <w:tcPr>
             <w:tcW w:w="4500" w:type="dxa"/>
@@ -8353,7 +8088,24 @@
                 <w:bCs/>
                 <w:color w:val="1B3A6B"/>
               </w:rPr>
-              <w:t>Sagar Biswas — Founder (40%)</w:t>
+              <w:lastRenderedPageBreak/>
+              <w:t>Sagar Biswas — Founder (</w:t>
+            </w:r>
+            <w:r>
+              <w:rPr>
+                <w:b/>
+                <w:bCs/>
+                <w:color w:val="1B3A6B"/>
+              </w:rPr>
+              <w:t>45</w:t>
+            </w:r>
+            <w:r>
+              <w:rPr>
+                <w:b/>
+                <w:bCs/>
+                <w:color w:val="1B3A6B"/>
+              </w:rPr>
+              <w:t>%)</w:t>
             </w:r>
           </w:p>
         </w:tc>
@@ -8406,12 +8158,6 @@
         </w:tc>
       </w:tr>
       <w:tr>
-        <w:tblPrEx>
-          <w:tblCellMar>
-            <w:top w:w="0" w:type="dxa"/>
-            <w:bottom w:w="0" w:type="dxa"/>
-          </w:tblCellMar>
-        </w:tblPrEx>
         <w:tc>
           <w:tcPr>
             <w:tcW w:w="4500" w:type="dxa"/>
@@ -8608,12 +8354,6 @@
         <w:gridCol w:w="4500"/>
       </w:tblGrid>
       <w:tr>
-        <w:tblPrEx>
-          <w:tblCellMar>
-            <w:top w:w="0" w:type="dxa"/>
-            <w:bottom w:w="0" w:type="dxa"/>
-          </w:tblCellMar>
-        </w:tblPrEx>
         <w:tc>
           <w:tcPr>
             <w:tcW w:w="4500" w:type="dxa"/>

</xml_diff>